<commit_message>
Expert prompt-engineering standard across all nine cards
All 27 mission prompts upgraded to the 2026 expert report (saved as
docs/PROMPT_GUIDANCE_2026.md): RTF structure, named-section and table
answer shaping, explicit failure states (DATA UNAVAILABLE,
INSUFFICIENT_DATA, NONE FOUND, NO EVIDENCE, NO ANOMALIES FOUND),
verbatim-quote grounding, probability scores summing to 100 per cent,
and spec-plan-code-self-check build pipelines. Card 09 rebuilt with the
expert's eight prompts house-styled plus four upgraded uniques,
including the new scenario-matrix brainstorming row. Brief docx
regenerated; drift guard extended for multi-line prompts.

Co-Authored-By: Claude Fable 5 <noreply@anthropic.com>
</commit_message>
<xml_diff>
--- a/public/placeholders/Venture_Research_Brief.docx
+++ b/public/placeholders/Venture_Research_Brief.docx
@@ -25,7 +25,47 @@
     </w:p>
     <w:p>
       <w:r>
-        <w:t>I am opening [a small Welsh cake stall on a UK university campus (Cardiff)]. Produce a sourced market briefing covering: who buys [from campus food stalls] and when (footfall patterns across the day and the academic year); realistic price expectations for [a fresh Welsh cake and comparable snacks]; who my competitors would be [on and near a typical campus, including mobile and permanent options]; what makes [small campus food ventures] succeed or fail, including [the regulatory basics for UK street food]; and three opportunities or risks I am probably not thinking about. Cite every source.</w:t>
+        <w:t>ROLE: You are a market research analyst preparing a briefing for a first-time food vendor.</w:t>
+      </w:r>
+    </w:p>
+    <w:p>
+      <w:r>
+        <w:t>TASK: Research the viability of [a small Welsh cake stall on a UK university campus (Cardiff)].</w:t>
+      </w:r>
+    </w:p>
+    <w:p>
+      <w:r>
+        <w:t>FORMAT: Use exactly these section headings:</w:t>
+      </w:r>
+    </w:p>
+    <w:p>
+      <w:r>
+        <w:t>- Who Buys, and When: footfall patterns for [campus food stalls] across the day and the academic year.</w:t>
+      </w:r>
+    </w:p>
+    <w:p>
+      <w:r>
+        <w:t>- Price Expectations: realistic prices for [a fresh Welsh cake and comparable snacks].</w:t>
+      </w:r>
+    </w:p>
+    <w:p>
+      <w:r>
+        <w:t>- Competitors: [on and near a typical campus, including mobile and permanent options].</w:t>
+      </w:r>
+    </w:p>
+    <w:p>
+      <w:r>
+        <w:t>- Succeed or Fail: what decides it for [small campus food ventures], including [the regulatory basics for UK street food].</w:t>
+      </w:r>
+    </w:p>
+    <w:p>
+      <w:r>
+        <w:t>- Blind Spots: three opportunities or risks I am probably not thinking about.</w:t>
+      </w:r>
+    </w:p>
+    <w:p>
+      <w:r>
+        <w:t>CONSTRAINTS: Cite every claim to its source. If a price or figure is not in your sources, write DATA UNAVAILABLE rather than estimating it.</w:t>
       </w:r>
     </w:p>
     <w:p>

</xml_diff>